<commit_message>
Support binding the parts into one master manual
Moves rendering into manual_lib.js so a spec can render two ways: standalone,
where the part is the whole document, and nested, where several parts are
bound together and every heading drops a level so the contents page reads as
a hierarchy rather than a flat list.

Figures are now numbered by the builder rather than hardcoded in the spec
captions, which lets numbering run continuously across a bound document.
Adds a contents page, carrying a note that Word builds it on first open.

Converts Part 1 from its one-off script to a spec so the whole series builds
the same way.

Co-Authored-By: Claude Opus 5 <noreply@anthropic.com>
Claude-Session: https://claude.ai/code/session_01NGLPCmZEnLwWWew5jbH6qG
</commit_message>
<xml_diff>
--- a/manuals/Payroll Processing - Part 1 - Payroll Prep.docx
+++ b/manuals/Payroll Processing - Part 1 - Payroll Prep.docx
@@ -52,7 +52,7 @@
     <w:p>
       <w:pPr>
         <w:pStyle w:val="Heading1"/>
-        <w:spacing w:after="160"/>
+        <w:spacing w:after="160" w:before="360"/>
       </w:pPr>
       <w:r>
         <w:rPr>
@@ -194,6 +194,11 @@
     </w:tbl>
     <w:p>
       <w:pPr>
+        <w:spacing w:after="200"/>
+      </w:pPr>
+    </w:p>
+    <w:p>
+      <w:pPr>
         <w:pStyle w:val="Heading1"/>
         <w:spacing w:after="160" w:before="360"/>
       </w:pPr>
@@ -217,7 +222,7 @@
           <w:sz w:val="22"/>
           <w:szCs w:val="22"/>
         </w:rPr>
-        <w:t xml:space="preserve">Throughout the fortnight you will receive emails covering anything that changes someone’s pay. These include:</w:t>
+        <w:t xml:space="preserve">Throughout the fortnight you will receive emails covering anything that changes someone's pay. These include:</w:t>
       </w:r>
     </w:p>
     <w:p>
@@ -413,6 +418,11 @@
     </w:tbl>
     <w:p>
       <w:pPr>
+        <w:spacing w:after="200"/>
+      </w:pPr>
+    </w:p>
+    <w:p>
+      <w:pPr>
         <w:pStyle w:val="Heading1"/>
         <w:spacing w:after="160" w:before="360"/>
       </w:pPr>
@@ -554,13 +564,13 @@
         </w:tblBorders>
       </w:tblPr>
       <w:tblGrid>
-        <w:gridCol w:w="2600"/>
-        <w:gridCol w:w="6760"/>
+        <w:gridCol w:w="2900"/>
+        <w:gridCol w:w="6460"/>
       </w:tblGrid>
       <w:tr>
         <w:tc>
           <w:tcPr>
-            <w:tcW w:type="dxa" w:w="2600"/>
+            <w:tcW w:type="dxa" w:w="2900"/>
             <w:shd w:fill="F7F9FC" w:val="clear"/>
             <w:tcMar>
               <w:top w:type="dxa" w:w="80"/>
@@ -583,7 +593,7 @@
         </w:tc>
         <w:tc>
           <w:tcPr>
-            <w:tcW w:type="dxa" w:w="6760"/>
+            <w:tcW w:type="dxa" w:w="6460"/>
             <w:shd w:fill="F7F9FC" w:val="clear"/>
             <w:tcMar>
               <w:top w:type="dxa" w:w="80"/>
@@ -595,6 +605,8 @@
           <w:p>
             <w:r>
               <w:rPr>
+                <w:b w:val="false"/>
+                <w:bCs w:val="false"/>
                 <w:sz w:val="20"/>
                 <w:szCs w:val="20"/>
               </w:rPr>
@@ -606,7 +618,7 @@
       <w:tr>
         <w:tc>
           <w:tcPr>
-            <w:tcW w:type="dxa" w:w="2600"/>
+            <w:tcW w:type="dxa" w:w="2900"/>
             <w:shd w:fill="FFFFFF" w:val="clear"/>
             <w:tcMar>
               <w:top w:type="dxa" w:w="80"/>
@@ -629,7 +641,7 @@
         </w:tc>
         <w:tc>
           <w:tcPr>
-            <w:tcW w:type="dxa" w:w="6760"/>
+            <w:tcW w:type="dxa" w:w="6460"/>
             <w:shd w:fill="FFFFFF" w:val="clear"/>
             <w:tcMar>
               <w:top w:type="dxa" w:w="80"/>
@@ -641,6 +653,8 @@
           <w:p>
             <w:r>
               <w:rPr>
+                <w:b w:val="false"/>
+                <w:bCs w:val="false"/>
                 <w:sz w:val="20"/>
                 <w:szCs w:val="20"/>
               </w:rPr>
@@ -652,7 +666,7 @@
       <w:tr>
         <w:tc>
           <w:tcPr>
-            <w:tcW w:type="dxa" w:w="2600"/>
+            <w:tcW w:type="dxa" w:w="2900"/>
             <w:shd w:fill="F7F9FC" w:val="clear"/>
             <w:tcMar>
               <w:top w:type="dxa" w:w="80"/>
@@ -675,7 +689,7 @@
         </w:tc>
         <w:tc>
           <w:tcPr>
-            <w:tcW w:type="dxa" w:w="6760"/>
+            <w:tcW w:type="dxa" w:w="6460"/>
             <w:shd w:fill="F7F9FC" w:val="clear"/>
             <w:tcMar>
               <w:top w:type="dxa" w:w="80"/>
@@ -687,6 +701,8 @@
           <w:p>
             <w:r>
               <w:rPr>
+                <w:b w:val="false"/>
+                <w:bCs w:val="false"/>
                 <w:sz w:val="20"/>
                 <w:szCs w:val="20"/>
               </w:rPr>
@@ -698,7 +714,7 @@
       <w:tr>
         <w:tc>
           <w:tcPr>
-            <w:tcW w:type="dxa" w:w="2600"/>
+            <w:tcW w:type="dxa" w:w="2900"/>
             <w:shd w:fill="FFFFFF" w:val="clear"/>
             <w:tcMar>
               <w:top w:type="dxa" w:w="80"/>
@@ -721,7 +737,7 @@
         </w:tc>
         <w:tc>
           <w:tcPr>
-            <w:tcW w:type="dxa" w:w="6760"/>
+            <w:tcW w:type="dxa" w:w="6460"/>
             <w:shd w:fill="FFFFFF" w:val="clear"/>
             <w:tcMar>
               <w:top w:type="dxa" w:w="80"/>
@@ -733,6 +749,8 @@
           <w:p>
             <w:r>
               <w:rPr>
+                <w:b w:val="false"/>
+                <w:bCs w:val="false"/>
                 <w:sz w:val="20"/>
                 <w:szCs w:val="20"/>
               </w:rPr>
@@ -934,6 +952,11 @@
     </w:tbl>
     <w:p>
       <w:pPr>
+        <w:spacing w:after="200"/>
+      </w:pPr>
+    </w:p>
+    <w:p>
+      <w:pPr>
         <w:pStyle w:val="Heading1"/>
         <w:spacing w:after="160" w:before="360"/>
       </w:pPr>
@@ -963,7 +986,7 @@
     <w:p>
       <w:pPr>
         <w:pStyle w:val="Heading2"/>
-        <w:spacing w:after="120" w:before="200"/>
+        <w:spacing w:after="160" w:before="360"/>
       </w:pPr>
       <w:r>
         <w:rPr>
@@ -1053,7 +1076,7 @@
     <w:p>
       <w:pPr>
         <w:pStyle w:val="Heading2"/>
-        <w:spacing w:after="120" w:before="200"/>
+        <w:spacing w:after="160" w:before="360"/>
       </w:pPr>
       <w:r>
         <w:rPr>
@@ -1183,12 +1206,17 @@
                 <w:sz w:val="22"/>
                 <w:szCs w:val="22"/>
               </w:rPr>
-              <w:t xml:space="preserve">Populate columns E to S only where the item affects the actual dollar value of the employee’s pay. A note that carries no pay impact belongs in the Notes section and nowhere else.</w:t>
+              <w:t xml:space="preserve">Populate columns E to S only where the item affects the actual dollar value of the employee's pay. A note that carries no pay impact belongs in the Notes section and nowhere else.</w:t>
             </w:r>
           </w:p>
         </w:tc>
       </w:tr>
     </w:tbl>
+    <w:p>
+      <w:pPr>
+        <w:spacing w:after="200"/>
+      </w:pPr>
+    </w:p>
     <w:p>
       <w:pPr>
         <w:pStyle w:val="Heading1"/>
@@ -1242,13 +1270,13 @@
         </w:tblBorders>
       </w:tblPr>
       <w:tblGrid>
-        <w:gridCol w:w="2600"/>
-        <w:gridCol w:w="6760"/>
+        <w:gridCol w:w="2900"/>
+        <w:gridCol w:w="6460"/>
       </w:tblGrid>
       <w:tr>
         <w:tc>
           <w:tcPr>
-            <w:tcW w:type="dxa" w:w="2600"/>
+            <w:tcW w:type="dxa" w:w="2900"/>
             <w:shd w:fill="F7F9FC" w:val="clear"/>
             <w:tcMar>
               <w:top w:type="dxa" w:w="80"/>
@@ -1271,7 +1299,7 @@
         </w:tc>
         <w:tc>
           <w:tcPr>
-            <w:tcW w:type="dxa" w:w="6760"/>
+            <w:tcW w:type="dxa" w:w="6460"/>
             <w:shd w:fill="F7F9FC" w:val="clear"/>
             <w:tcMar>
               <w:top w:type="dxa" w:w="80"/>
@@ -1283,6 +1311,8 @@
           <w:p>
             <w:r>
               <w:rPr>
+                <w:b w:val="false"/>
+                <w:bCs w:val="false"/>
                 <w:sz w:val="20"/>
                 <w:szCs w:val="20"/>
               </w:rPr>
@@ -1294,7 +1324,7 @@
       <w:tr>
         <w:tc>
           <w:tcPr>
-            <w:tcW w:type="dxa" w:w="2600"/>
+            <w:tcW w:type="dxa" w:w="2900"/>
             <w:shd w:fill="FFFFFF" w:val="clear"/>
             <w:tcMar>
               <w:top w:type="dxa" w:w="80"/>
@@ -1317,7 +1347,7 @@
         </w:tc>
         <w:tc>
           <w:tcPr>
-            <w:tcW w:type="dxa" w:w="6760"/>
+            <w:tcW w:type="dxa" w:w="6460"/>
             <w:shd w:fill="FFFFFF" w:val="clear"/>
             <w:tcMar>
               <w:top w:type="dxa" w:w="80"/>
@@ -1329,6 +1359,8 @@
           <w:p>
             <w:r>
               <w:rPr>
+                <w:b w:val="false"/>
+                <w:bCs w:val="false"/>
                 <w:sz w:val="20"/>
                 <w:szCs w:val="20"/>
               </w:rPr>
@@ -1502,8 +1534,13 @@
     </w:tbl>
     <w:p>
       <w:pPr>
+        <w:spacing w:after="200"/>
+      </w:pPr>
+    </w:p>
+    <w:p>
+      <w:pPr>
         <w:pStyle w:val="Heading1"/>
-        <w:spacing w:after="160" w:before="400"/>
+        <w:spacing w:after="160" w:before="360"/>
       </w:pPr>
       <w:r>
         <w:rPr>

</xml_diff>

<commit_message>
Correct the part count and make the contents page navigable
Parts 1 and 2 still described a six-part series; there are eight. Part 5
referred to a range of "Parts 3a to 4", which does not read as a range.

Every part also opened with a heading of "About this guide", so the bound
manual listed that phrase eight times in its contents. Each is now named
for its part.

Co-Authored-By: Claude Opus 5 <noreply@anthropic.com>
Claude-Session: https://claude.ai/code/session_01NGLPCmZEnLwWWew5jbH6qG
</commit_message>
<xml_diff>
--- a/manuals/Payroll Processing - Part 1 - Payroll Prep.docx
+++ b/manuals/Payroll Processing - Part 1 - Payroll Prep.docx
@@ -62,7 +62,7 @@
           <w:sz w:val="28"/>
           <w:szCs w:val="28"/>
         </w:rPr>
-        <w:t xml:space="preserve">About this guide</w:t>
+        <w:t xml:space="preserve">About Part 1</w:t>
       </w:r>
     </w:p>
     <w:p>
@@ -74,7 +74,7 @@
           <w:sz w:val="22"/>
           <w:szCs w:val="22"/>
         </w:rPr>
-        <w:t xml:space="preserve">Payroll at CTS runs on a fortnightly cycle. This guide covers Payroll Prep: everything that must be done before a pay run is created. It is the first of a six-part series.</w:t>
+        <w:t xml:space="preserve">Payroll at CTS runs on a fortnightly cycle. This guide covers Payroll Prep: everything that must be done before a pay run is created. It is the first of eight parts.</w:t>
       </w:r>
     </w:p>
     <w:p>

</xml_diff>